<commit_message>
updated the extraction of entities where it extract from the the column only
</commit_message>
<xml_diff>
--- a/public/files/ICS_WAR-TEMPLATE.docx
+++ b/public/files/ICS_WAR-TEMPLATE.docx
@@ -118,7 +118,7 @@
     </w:p>
     <w:tbl>
       <w:tblPr>
-        <w:tblW w:w="0" w:type="auto"/>
+        <w:tblW w:w="9039" w:type="dxa"/>
         <w:tblCellMar>
           <w:top w:w="15" w:type="dxa"/>
           <w:left w:w="15" w:type="dxa"/>
@@ -196,7 +196,7 @@
             <w:pPr>
               <w:spacing w:after="0" w:line="240" w:lineRule="auto"/>
               <w:rPr>
-                <w:rFonts w:ascii="Times New Roman" w:eastAsia="Times New Roman" w:hAnsi="Times New Roman" w:cs="Times New Roman"/>
+                <w:rFonts w:ascii="Arial" w:eastAsia="Times New Roman" w:hAnsi="Arial" w:cs="Arial"/>
                 <w:sz w:val="24"/>
                 <w:szCs w:val="24"/>
                 <w:lang w:eastAsia="en-GB"/>
@@ -271,7 +271,7 @@
             <w:pPr>
               <w:spacing w:after="0" w:line="240" w:lineRule="auto"/>
               <w:rPr>
-                <w:rFonts w:ascii="Times New Roman" w:eastAsia="Times New Roman" w:hAnsi="Times New Roman" w:cs="Times New Roman"/>
+                <w:rFonts w:ascii="Arial" w:eastAsia="Times New Roman" w:hAnsi="Arial" w:cs="Arial"/>
                 <w:sz w:val="24"/>
                 <w:szCs w:val="24"/>
                 <w:lang w:eastAsia="en-GB"/>
@@ -409,7 +409,7 @@
           <w:szCs w:val="20"/>
           <w:lang w:eastAsia="en-GB"/>
         </w:rPr>
-        <w:t>1. _____________________________________________________________________</w:t>
+        <w:t>1. _______________________________________________________________</w:t>
       </w:r>
     </w:p>
     <w:p>
@@ -554,8 +554,8 @@
             <w:pPr>
               <w:spacing w:after="0" w:line="240" w:lineRule="auto"/>
               <w:rPr>
-                <w:rFonts w:ascii="Times New Roman" w:eastAsia="Times New Roman" w:hAnsi="Times New Roman" w:cs="Times New Roman"/>
-                <w:sz w:val="24"/>
+                <w:rFonts w:ascii="Arial" w:eastAsia="Times New Roman" w:hAnsi="Arial" w:cs="Arial"/>
+                <w:sz w:val="20"/>
                 <w:szCs w:val="24"/>
                 <w:lang w:eastAsia="en-GB"/>
               </w:rPr>
@@ -583,12 +583,14 @@
             <w:pPr>
               <w:spacing w:after="0" w:line="240" w:lineRule="auto"/>
               <w:rPr>
-                <w:rFonts w:ascii="Times New Roman" w:eastAsia="Times New Roman" w:hAnsi="Times New Roman" w:cs="Times New Roman"/>
-                <w:sz w:val="24"/>
-                <w:szCs w:val="24"/>
-                <w:lang w:eastAsia="en-GB"/>
-              </w:rPr>
-            </w:pPr>
+                <w:rFonts w:ascii="Arial" w:eastAsia="Times New Roman" w:hAnsi="Arial" w:cs="Arial"/>
+                <w:sz w:val="20"/>
+                <w:szCs w:val="24"/>
+                <w:lang w:eastAsia="en-GB"/>
+              </w:rPr>
+            </w:pPr>
+            <w:bookmarkStart w:id="0" w:name="_GoBack"/>
+            <w:bookmarkEnd w:id="0"/>
           </w:p>
         </w:tc>
       </w:tr>
@@ -617,8 +619,8 @@
             <w:pPr>
               <w:spacing w:after="0" w:line="240" w:lineRule="auto"/>
               <w:rPr>
-                <w:rFonts w:ascii="Times New Roman" w:eastAsia="Times New Roman" w:hAnsi="Times New Roman" w:cs="Times New Roman"/>
-                <w:sz w:val="24"/>
+                <w:rFonts w:ascii="Arial" w:eastAsia="Times New Roman" w:hAnsi="Arial" w:cs="Arial"/>
+                <w:sz w:val="20"/>
                 <w:szCs w:val="24"/>
                 <w:lang w:eastAsia="en-GB"/>
               </w:rPr>
@@ -646,8 +648,8 @@
             <w:pPr>
               <w:spacing w:after="0" w:line="240" w:lineRule="auto"/>
               <w:rPr>
-                <w:rFonts w:ascii="Times New Roman" w:eastAsia="Times New Roman" w:hAnsi="Times New Roman" w:cs="Times New Roman"/>
-                <w:sz w:val="24"/>
+                <w:rFonts w:ascii="Arial" w:eastAsia="Times New Roman" w:hAnsi="Arial" w:cs="Arial"/>
+                <w:sz w:val="20"/>
                 <w:szCs w:val="24"/>
                 <w:lang w:eastAsia="en-GB"/>
               </w:rPr>
@@ -680,8 +682,8 @@
             <w:pPr>
               <w:spacing w:after="0" w:line="240" w:lineRule="auto"/>
               <w:rPr>
-                <w:rFonts w:ascii="Times New Roman" w:eastAsia="Times New Roman" w:hAnsi="Times New Roman" w:cs="Times New Roman"/>
-                <w:sz w:val="24"/>
+                <w:rFonts w:ascii="Arial" w:eastAsia="Times New Roman" w:hAnsi="Arial" w:cs="Arial"/>
+                <w:sz w:val="20"/>
                 <w:szCs w:val="24"/>
                 <w:lang w:eastAsia="en-GB"/>
               </w:rPr>
@@ -709,8 +711,8 @@
             <w:pPr>
               <w:spacing w:after="0" w:line="240" w:lineRule="auto"/>
               <w:rPr>
-                <w:rFonts w:ascii="Times New Roman" w:eastAsia="Times New Roman" w:hAnsi="Times New Roman" w:cs="Times New Roman"/>
-                <w:sz w:val="24"/>
+                <w:rFonts w:ascii="Arial" w:eastAsia="Times New Roman" w:hAnsi="Arial" w:cs="Arial"/>
+                <w:sz w:val="20"/>
                 <w:szCs w:val="24"/>
                 <w:lang w:eastAsia="en-GB"/>
               </w:rPr>
@@ -743,8 +745,8 @@
             <w:pPr>
               <w:spacing w:after="0" w:line="240" w:lineRule="auto"/>
               <w:rPr>
-                <w:rFonts w:ascii="Times New Roman" w:eastAsia="Times New Roman" w:hAnsi="Times New Roman" w:cs="Times New Roman"/>
-                <w:sz w:val="24"/>
+                <w:rFonts w:ascii="Arial" w:eastAsia="Times New Roman" w:hAnsi="Arial" w:cs="Arial"/>
+                <w:sz w:val="20"/>
                 <w:szCs w:val="24"/>
                 <w:lang w:eastAsia="en-GB"/>
               </w:rPr>
@@ -772,8 +774,8 @@
             <w:pPr>
               <w:spacing w:after="0" w:line="240" w:lineRule="auto"/>
               <w:rPr>
-                <w:rFonts w:ascii="Times New Roman" w:eastAsia="Times New Roman" w:hAnsi="Times New Roman" w:cs="Times New Roman"/>
-                <w:sz w:val="24"/>
+                <w:rFonts w:ascii="Arial" w:eastAsia="Times New Roman" w:hAnsi="Arial" w:cs="Arial"/>
+                <w:sz w:val="20"/>
                 <w:szCs w:val="24"/>
                 <w:lang w:eastAsia="en-GB"/>
               </w:rPr>
@@ -806,8 +808,8 @@
             <w:pPr>
               <w:spacing w:after="0" w:line="240" w:lineRule="auto"/>
               <w:rPr>
-                <w:rFonts w:ascii="Times New Roman" w:eastAsia="Times New Roman" w:hAnsi="Times New Roman" w:cs="Times New Roman"/>
-                <w:sz w:val="24"/>
+                <w:rFonts w:ascii="Arial" w:eastAsia="Times New Roman" w:hAnsi="Arial" w:cs="Arial"/>
+                <w:sz w:val="20"/>
                 <w:szCs w:val="24"/>
                 <w:lang w:eastAsia="en-GB"/>
               </w:rPr>
@@ -835,8 +837,8 @@
             <w:pPr>
               <w:spacing w:after="0" w:line="240" w:lineRule="auto"/>
               <w:rPr>
-                <w:rFonts w:ascii="Times New Roman" w:eastAsia="Times New Roman" w:hAnsi="Times New Roman" w:cs="Times New Roman"/>
-                <w:sz w:val="24"/>
+                <w:rFonts w:ascii="Arial" w:eastAsia="Times New Roman" w:hAnsi="Arial" w:cs="Arial"/>
+                <w:sz w:val="20"/>
                 <w:szCs w:val="24"/>
                 <w:lang w:eastAsia="en-GB"/>
               </w:rPr>
@@ -869,8 +871,8 @@
             <w:pPr>
               <w:spacing w:after="0" w:line="240" w:lineRule="auto"/>
               <w:rPr>
-                <w:rFonts w:ascii="Times New Roman" w:eastAsia="Times New Roman" w:hAnsi="Times New Roman" w:cs="Times New Roman"/>
-                <w:sz w:val="24"/>
+                <w:rFonts w:ascii="Arial" w:eastAsia="Times New Roman" w:hAnsi="Arial" w:cs="Arial"/>
+                <w:sz w:val="20"/>
                 <w:szCs w:val="24"/>
                 <w:lang w:eastAsia="en-GB"/>
               </w:rPr>
@@ -898,8 +900,8 @@
             <w:pPr>
               <w:spacing w:after="0" w:line="240" w:lineRule="auto"/>
               <w:rPr>
-                <w:rFonts w:ascii="Times New Roman" w:eastAsia="Times New Roman" w:hAnsi="Times New Roman" w:cs="Times New Roman"/>
-                <w:sz w:val="24"/>
+                <w:rFonts w:ascii="Arial" w:eastAsia="Times New Roman" w:hAnsi="Arial" w:cs="Arial"/>
+                <w:sz w:val="20"/>
                 <w:szCs w:val="24"/>
                 <w:lang w:eastAsia="en-GB"/>
               </w:rPr>
@@ -924,8 +926,6 @@
         </w:rPr>
         <w:t>Documentation:</w:t>
       </w:r>
-      <w:bookmarkStart w:id="0" w:name="_GoBack"/>
-      <w:bookmarkEnd w:id="0"/>
     </w:p>
     <w:p/>
     <w:p/>
@@ -939,7 +939,7 @@
         <mc:AlternateContent>
           <mc:Choice Requires="wpg">
             <w:drawing>
-              <wp:anchor distT="0" distB="0" distL="0" distR="0" simplePos="0" relativeHeight="251659264" behindDoc="1" locked="0" layoutInCell="1" allowOverlap="1" wp14:anchorId="76836371" wp14:editId="298AE7C1">
+              <wp:anchor distT="0" distB="0" distL="0" distR="0" simplePos="0" relativeHeight="251659264" behindDoc="1" locked="0" layoutInCell="1" allowOverlap="1" wp14:anchorId="05E52BEF" wp14:editId="43D31331">
                 <wp:simplePos x="0" y="0"/>
                 <wp:positionH relativeFrom="page">
                   <wp:posOffset>156095</wp:posOffset>

</xml_diff>